<commit_message>
Expand project report specs and add executable build.sh for Render deployment
</commit_message>
<xml_diff>
--- a/comprehensive_project_report.docx
+++ b/comprehensive_project_report.docx
@@ -1110,7 +1110,22 @@
           <w:color w:val="4F46E5"/>
           <w:sz w:val="44"/>
         </w:rPr>
-        <w:t>6. UI/UX Design (Frontend)</w:t>
+        <w:t>6. UI/UX Design &amp; Frontend Implementation Specification</w:t>
+      </w:r>
+    </w:p>
+    <w:p>
+      <w:pPr>
+        <w:spacing w:after="120" w:line="276" w:lineRule="auto"/>
+        <w:jc w:val="left"/>
+      </w:pPr>
+      <w:r>
+        <w:rPr>
+          <w:rFonts w:ascii="Outfit" w:hAnsi="Outfit"/>
+          <w:b w:val="0"/>
+          <w:i w:val="0"/>
+          <w:sz w:val="22"/>
+        </w:rPr>
+        <w:t>The frontend architecture of Web Wizards Car Rentals is built from the ground up on modern design principles that emphasize immersion, high-performance interactions, and responsive visual feedback. By rejecting default browser components, the interface implements a bespoke Cyber-Noir / Midnight Glassmorphism aesthetic tailored to high-end digital consumers.</w:t>
       </w:r>
     </w:p>
     <w:p>
@@ -1126,7 +1141,7 @@
           <w:color w:val="EC4899"/>
           <w:sz w:val="32"/>
         </w:rPr>
-        <w:t>6.1 Style &amp; Layout Variables</w:t>
+        <w:t>6.1 Core Design Philosophy and Usability Guidelines</w:t>
       </w:r>
     </w:p>
     <w:p>
@@ -1141,7 +1156,7 @@
           <w:i w:val="0"/>
           <w:sz w:val="22"/>
         </w:rPr>
-        <w:t>The frontend utilizes CSS Variables in base.html to implement a premium aesthetic:</w:t>
+        <w:t>1. Premium Cybernetic Depth: Employs a dark midnight backdrop integrated with floating glowing neon accents and a responsive matrix cyber-grid to convey speed, technology, and luxury.</w:t>
       </w:r>
     </w:p>
     <w:p>
@@ -1156,7 +1171,7 @@
           <w:i w:val="0"/>
           <w:sz w:val="22"/>
         </w:rPr>
-        <w:t>- Background tone: Deep navy dark (#0B0F19)</w:t>
+        <w:t>2. Glassmorphism Layering Hierarchy: Utilizes translucent panels with backdrop-blur filters, thin luminous borders, and soft shadows to simulate layers of physically-stacked glass cards.</w:t>
       </w:r>
     </w:p>
     <w:p>
@@ -1171,7 +1186,7 @@
           <w:i w:val="0"/>
           <w:sz w:val="22"/>
         </w:rPr>
-        <w:t>- Card containers: Semi-transparent glassmorphic panels with backdrop filter blurs (blur(12px)) and subtle borders (1px solid rgba(255,255,255,0.08))</w:t>
+        <w:t>3. Cognitive Load Minimization &amp; Micro-Interactions: Provides immediate visual rewards for user actions. Hover actions trigger 3D perspective shifts, glow enhancements, and smooth hardware-accelerated transitions.</w:t>
       </w:r>
     </w:p>
     <w:p>
@@ -1186,7 +1201,23 @@
           <w:i w:val="0"/>
           <w:sz w:val="22"/>
         </w:rPr>
-        <w:t>- Accent colors: Glowing Indigo (#4F46E5) and neon Hot Pink (#EC4899)</w:t>
+        <w:t>4. Mobile-First Responsiveness: Core grid layouts dynamically collapse from complex multi-column viewports into simple, clean vertical stacks, replacing traditional sidebars with off-canvas drawer systems.</w:t>
+      </w:r>
+    </w:p>
+    <w:p>
+      <w:pPr>
+        <w:pStyle w:val="Heading2"/>
+        <w:keepNext/>
+        <w:spacing w:before="240" w:after="120"/>
+      </w:pPr>
+      <w:r>
+        <w:rPr>
+          <w:rFonts w:ascii="Outfit" w:hAnsi="Outfit"/>
+          <w:b/>
+          <w:color w:val="EC4899"/>
+          <w:sz w:val="32"/>
+        </w:rPr>
+        <w:t>6.2 The Design Token System (CSS Root Variables)</w:t>
       </w:r>
     </w:p>
     <w:p>
@@ -1201,7 +1232,898 @@
           <w:i w:val="0"/>
           <w:sz w:val="22"/>
         </w:rPr>
-        <w:t>- Fonts: Geometric sans-serif Google Fonts ('Outfit' &amp; 'Inter') for modern typography.</w:t>
+        <w:t>The system establishes a single source of truth for the entire interface using responsive CSS custom properties defined within the root block of base.html:</w:t>
+      </w:r>
+    </w:p>
+    <w:tbl>
+      <w:tblPr>
+        <w:tblW w:type="auto" w:w="0"/>
+        <w:jc w:val="center"/>
+        <w:tblLook w:firstColumn="1" w:firstRow="1" w:lastColumn="0" w:lastRow="0" w:noHBand="0" w:noVBand="1" w:val="04A0"/>
+      </w:tblPr>
+      <w:tblGrid>
+        <w:gridCol w:w="3120"/>
+        <w:gridCol w:w="3120"/>
+        <w:gridCol w:w="3120"/>
+      </w:tblGrid>
+      <w:tr>
+        <w:tc>
+          <w:tcPr>
+            <w:tcW w:type="dxa" w:w="3120"/>
+            <w:shd w:val="clear" w:color="auto" w:fill="4F46E5"/>
+          </w:tcPr>
+          <w:p>
+            <w:r>
+              <w:rPr>
+                <w:b/>
+                <w:color w:val="FFFFFF"/>
+              </w:rPr>
+              <w:t>CSS Custom Property</w:t>
+            </w:r>
+          </w:p>
+        </w:tc>
+        <w:tc>
+          <w:tcPr>
+            <w:tcW w:type="dxa" w:w="3120"/>
+            <w:shd w:val="clear" w:color="auto" w:fill="4F46E5"/>
+          </w:tcPr>
+          <w:p>
+            <w:r>
+              <w:rPr>
+                <w:b/>
+                <w:color w:val="FFFFFF"/>
+              </w:rPr>
+              <w:t>Exact Color / Value</w:t>
+            </w:r>
+          </w:p>
+        </w:tc>
+        <w:tc>
+          <w:tcPr>
+            <w:tcW w:type="dxa" w:w="3120"/>
+            <w:shd w:val="clear" w:color="auto" w:fill="4F46E5"/>
+          </w:tcPr>
+          <w:p>
+            <w:r>
+              <w:rPr>
+                <w:b/>
+                <w:color w:val="FFFFFF"/>
+              </w:rPr>
+              <w:t>Functional UI/UX Role</w:t>
+            </w:r>
+          </w:p>
+        </w:tc>
+      </w:tr>
+      <w:tr>
+        <w:tc>
+          <w:tcPr>
+            <w:tcW w:type="dxa" w:w="3120"/>
+          </w:tcPr>
+          <w:p>
+            <w:r>
+              <w:t>--bg-main</w:t>
+            </w:r>
+          </w:p>
+        </w:tc>
+        <w:tc>
+          <w:tcPr>
+            <w:tcW w:type="dxa" w:w="3120"/>
+          </w:tcPr>
+          <w:p>
+            <w:r>
+              <w:t>#0B0F19 (Midnight Black)</w:t>
+            </w:r>
+          </w:p>
+        </w:tc>
+        <w:tc>
+          <w:tcPr>
+            <w:tcW w:type="dxa" w:w="3120"/>
+          </w:tcPr>
+          <w:p>
+            <w:r>
+              <w:t>Base canvas background for the entire application</w:t>
+            </w:r>
+          </w:p>
+        </w:tc>
+      </w:tr>
+      <w:tr>
+        <w:tc>
+          <w:tcPr>
+            <w:tcW w:type="dxa" w:w="3120"/>
+          </w:tcPr>
+          <w:p>
+            <w:r>
+              <w:t>--bg-darker</w:t>
+            </w:r>
+          </w:p>
+        </w:tc>
+        <w:tc>
+          <w:tcPr>
+            <w:tcW w:type="dxa" w:w="3120"/>
+          </w:tcPr>
+          <w:p>
+            <w:r>
+              <w:t>#07090F (Pitch Obsidian)</w:t>
+            </w:r>
+          </w:p>
+        </w:tc>
+        <w:tc>
+          <w:tcPr>
+            <w:tcW w:type="dxa" w:w="3120"/>
+          </w:tcPr>
+          <w:p>
+            <w:r>
+              <w:t>Dark contrast background for off-canvas drawer navigation and footers</w:t>
+            </w:r>
+          </w:p>
+        </w:tc>
+      </w:tr>
+      <w:tr>
+        <w:tc>
+          <w:tcPr>
+            <w:tcW w:type="dxa" w:w="3120"/>
+          </w:tcPr>
+          <w:p>
+            <w:r>
+              <w:t>--bg-card</w:t>
+            </w:r>
+          </w:p>
+        </w:tc>
+        <w:tc>
+          <w:tcPr>
+            <w:tcW w:type="dxa" w:w="3120"/>
+          </w:tcPr>
+          <w:p>
+            <w:r>
+              <w:t>rgba(17, 24, 39, 0.7)</w:t>
+            </w:r>
+          </w:p>
+        </w:tc>
+        <w:tc>
+          <w:tcPr>
+            <w:tcW w:type="dxa" w:w="3120"/>
+          </w:tcPr>
+          <w:p>
+            <w:r>
+              <w:t>Foundation backing for glassmorphic cards and interactive panels</w:t>
+            </w:r>
+          </w:p>
+        </w:tc>
+      </w:tr>
+      <w:tr>
+        <w:tc>
+          <w:tcPr>
+            <w:tcW w:type="dxa" w:w="3120"/>
+          </w:tcPr>
+          <w:p>
+            <w:r>
+              <w:t>--border-color</w:t>
+            </w:r>
+          </w:p>
+        </w:tc>
+        <w:tc>
+          <w:tcPr>
+            <w:tcW w:type="dxa" w:w="3120"/>
+          </w:tcPr>
+          <w:p>
+            <w:r>
+              <w:t>rgba(255, 255, 255, 0.08)</w:t>
+            </w:r>
+          </w:p>
+        </w:tc>
+        <w:tc>
+          <w:tcPr>
+            <w:tcW w:type="dxa" w:w="3120"/>
+          </w:tcPr>
+          <w:p>
+            <w:r>
+              <w:t>Subtle perimeter border for cards, mimicking light refractiveness</w:t>
+            </w:r>
+          </w:p>
+        </w:tc>
+      </w:tr>
+      <w:tr>
+        <w:tc>
+          <w:tcPr>
+            <w:tcW w:type="dxa" w:w="3120"/>
+          </w:tcPr>
+          <w:p>
+            <w:r>
+              <w:t>--border-color-hover</w:t>
+            </w:r>
+          </w:p>
+        </w:tc>
+        <w:tc>
+          <w:tcPr>
+            <w:tcW w:type="dxa" w:w="3120"/>
+          </w:tcPr>
+          <w:p>
+            <w:r>
+              <w:t>rgba(255, 255, 255, 0.15)</w:t>
+            </w:r>
+          </w:p>
+        </w:tc>
+        <w:tc>
+          <w:tcPr>
+            <w:tcW w:type="dxa" w:w="3120"/>
+          </w:tcPr>
+          <w:p>
+            <w:r>
+              <w:t>High-contrast refractiveness border triggered on card hover states</w:t>
+            </w:r>
+          </w:p>
+        </w:tc>
+      </w:tr>
+      <w:tr>
+        <w:tc>
+          <w:tcPr>
+            <w:tcW w:type="dxa" w:w="3120"/>
+          </w:tcPr>
+          <w:p>
+            <w:r>
+              <w:t>--primary</w:t>
+            </w:r>
+          </w:p>
+        </w:tc>
+        <w:tc>
+          <w:tcPr>
+            <w:tcW w:type="dxa" w:w="3120"/>
+          </w:tcPr>
+          <w:p>
+            <w:r>
+              <w:t>#4F46E5 (Vibrant Indigo)</w:t>
+            </w:r>
+          </w:p>
+        </w:tc>
+        <w:tc>
+          <w:tcPr>
+            <w:tcW w:type="dxa" w:w="3120"/>
+          </w:tcPr>
+          <w:p>
+            <w:r>
+              <w:t>Primary branding element, button fills, and active links</w:t>
+            </w:r>
+          </w:p>
+        </w:tc>
+      </w:tr>
+      <w:tr>
+        <w:tc>
+          <w:tcPr>
+            <w:tcW w:type="dxa" w:w="3120"/>
+          </w:tcPr>
+          <w:p>
+            <w:r>
+              <w:t>--primary-glow</w:t>
+            </w:r>
+          </w:p>
+        </w:tc>
+        <w:tc>
+          <w:tcPr>
+            <w:tcW w:type="dxa" w:w="3120"/>
+          </w:tcPr>
+          <w:p>
+            <w:r>
+              <w:t>rgba(79, 70, 229, 0.4)</w:t>
+            </w:r>
+          </w:p>
+        </w:tc>
+        <w:tc>
+          <w:tcPr>
+            <w:tcW w:type="dxa" w:w="3120"/>
+          </w:tcPr>
+          <w:p>
+            <w:r>
+              <w:t>Blur glow shadow for active inputs and key click triggers</w:t>
+            </w:r>
+          </w:p>
+        </w:tc>
+      </w:tr>
+      <w:tr>
+        <w:tc>
+          <w:tcPr>
+            <w:tcW w:type="dxa" w:w="3120"/>
+          </w:tcPr>
+          <w:p>
+            <w:r>
+              <w:t>--accent</w:t>
+            </w:r>
+          </w:p>
+        </w:tc>
+        <w:tc>
+          <w:tcPr>
+            <w:tcW w:type="dxa" w:w="3120"/>
+          </w:tcPr>
+          <w:p>
+            <w:r>
+              <w:t>#EC4899 (Electric Hot Pink)</w:t>
+            </w:r>
+          </w:p>
+        </w:tc>
+        <w:tc>
+          <w:tcPr>
+            <w:tcW w:type="dxa" w:w="3120"/>
+          </w:tcPr>
+          <w:p>
+            <w:r>
+              <w:t>High-contrast accent color, checkout CTA highlights, and alert status</w:t>
+            </w:r>
+          </w:p>
+        </w:tc>
+      </w:tr>
+      <w:tr>
+        <w:tc>
+          <w:tcPr>
+            <w:tcW w:type="dxa" w:w="3120"/>
+          </w:tcPr>
+          <w:p>
+            <w:r>
+              <w:t>--accent-glow</w:t>
+            </w:r>
+          </w:p>
+        </w:tc>
+        <w:tc>
+          <w:tcPr>
+            <w:tcW w:type="dxa" w:w="3120"/>
+          </w:tcPr>
+          <w:p>
+            <w:r>
+              <w:t>rgba(236, 72, 153, 0.4)</w:t>
+            </w:r>
+          </w:p>
+        </w:tc>
+        <w:tc>
+          <w:tcPr>
+            <w:tcW w:type="dxa" w:w="3120"/>
+          </w:tcPr>
+          <w:p>
+            <w:r>
+              <w:t>Glowing shadow maps for special checkout elements and action highlights</w:t>
+            </w:r>
+          </w:p>
+        </w:tc>
+      </w:tr>
+      <w:tr>
+        <w:tc>
+          <w:tcPr>
+            <w:tcW w:type="dxa" w:w="3120"/>
+          </w:tcPr>
+          <w:p>
+            <w:r>
+              <w:t>--success</w:t>
+            </w:r>
+          </w:p>
+        </w:tc>
+        <w:tc>
+          <w:tcPr>
+            <w:tcW w:type="dxa" w:w="3120"/>
+          </w:tcPr>
+          <w:p>
+            <w:r>
+              <w:t>#10B981 (Emerald Green)</w:t>
+            </w:r>
+          </w:p>
+        </w:tc>
+        <w:tc>
+          <w:tcPr>
+            <w:tcW w:type="dxa" w:w="3120"/>
+          </w:tcPr>
+          <w:p>
+            <w:r>
+              <w:t>High-visibility indicators for approved items, paid bookings, and validations</w:t>
+            </w:r>
+          </w:p>
+        </w:tc>
+      </w:tr>
+      <w:tr>
+        <w:tc>
+          <w:tcPr>
+            <w:tcW w:type="dxa" w:w="3120"/>
+          </w:tcPr>
+          <w:p>
+            <w:r>
+              <w:t>--warning</w:t>
+            </w:r>
+          </w:p>
+        </w:tc>
+        <w:tc>
+          <w:tcPr>
+            <w:tcW w:type="dxa" w:w="3120"/>
+          </w:tcPr>
+          <w:p>
+            <w:r>
+              <w:t>#F59E0B (Amber Gold)</w:t>
+            </w:r>
+          </w:p>
+        </w:tc>
+        <w:tc>
+          <w:tcPr>
+            <w:tcW w:type="dxa" w:w="3120"/>
+          </w:tcPr>
+          <w:p>
+            <w:r>
+              <w:t>Warning markers for pending actions or administrative review statuses</w:t>
+            </w:r>
+          </w:p>
+        </w:tc>
+      </w:tr>
+      <w:tr>
+        <w:tc>
+          <w:tcPr>
+            <w:tcW w:type="dxa" w:w="3120"/>
+          </w:tcPr>
+          <w:p>
+            <w:r>
+              <w:t>--danger</w:t>
+            </w:r>
+          </w:p>
+        </w:tc>
+        <w:tc>
+          <w:tcPr>
+            <w:tcW w:type="dxa" w:w="3120"/>
+          </w:tcPr>
+          <w:p>
+            <w:r>
+              <w:t>#EF4444 (Coral Crimson)</w:t>
+            </w:r>
+          </w:p>
+        </w:tc>
+        <w:tc>
+          <w:tcPr>
+            <w:tcW w:type="dxa" w:w="3120"/>
+          </w:tcPr>
+          <w:p>
+            <w:r>
+              <w:t>Critical warning indicators for cancellations, rejections, and error messages</w:t>
+            </w:r>
+          </w:p>
+        </w:tc>
+      </w:tr>
+      <w:tr>
+        <w:tc>
+          <w:tcPr>
+            <w:tcW w:type="dxa" w:w="3120"/>
+          </w:tcPr>
+          <w:p>
+            <w:r>
+              <w:t>--glass-blur</w:t>
+            </w:r>
+          </w:p>
+        </w:tc>
+        <w:tc>
+          <w:tcPr>
+            <w:tcW w:type="dxa" w:w="3120"/>
+          </w:tcPr>
+          <w:p>
+            <w:r>
+              <w:t>blur(12px)</w:t>
+            </w:r>
+          </w:p>
+        </w:tc>
+        <w:tc>
+          <w:tcPr>
+            <w:tcW w:type="dxa" w:w="3120"/>
+          </w:tcPr>
+          <w:p>
+            <w:r>
+              <w:t>WebKit backdrop filtering rule to blur background elements behind glass</w:t>
+            </w:r>
+          </w:p>
+        </w:tc>
+      </w:tr>
+      <w:tr>
+        <w:tc>
+          <w:tcPr>
+            <w:tcW w:type="dxa" w:w="3120"/>
+          </w:tcPr>
+          <w:p>
+            <w:r>
+              <w:t>--glass-shadow</w:t>
+            </w:r>
+          </w:p>
+        </w:tc>
+        <w:tc>
+          <w:tcPr>
+            <w:tcW w:type="dxa" w:w="3120"/>
+          </w:tcPr>
+          <w:p>
+            <w:r>
+              <w:t>0 8px 32px 0 rgba(0, 0, 0, 0.37)</w:t>
+            </w:r>
+          </w:p>
+        </w:tc>
+        <w:tc>
+          <w:tcPr>
+            <w:tcW w:type="dxa" w:w="3120"/>
+          </w:tcPr>
+          <w:p>
+            <w:r>
+              <w:t>Deep-cast box shadow mapping to simulate vertical elevation layers</w:t>
+            </w:r>
+          </w:p>
+        </w:tc>
+      </w:tr>
+      <w:tr>
+        <w:tc>
+          <w:tcPr>
+            <w:tcW w:type="dxa" w:w="3120"/>
+          </w:tcPr>
+          <w:p>
+            <w:r>
+              <w:t>--transition</w:t>
+            </w:r>
+          </w:p>
+        </w:tc>
+        <w:tc>
+          <w:tcPr>
+            <w:tcW w:type="dxa" w:w="3120"/>
+          </w:tcPr>
+          <w:p>
+            <w:r>
+              <w:t>all 0.3s cubic-bezier(0.4, 0, 0.2, 1)</w:t>
+            </w:r>
+          </w:p>
+        </w:tc>
+        <w:tc>
+          <w:tcPr>
+            <w:tcW w:type="dxa" w:w="3120"/>
+          </w:tcPr>
+          <w:p>
+            <w:r>
+              <w:t>Standardized ease-out bezier curve ensuring fluid fluid animation flow</w:t>
+            </w:r>
+          </w:p>
+        </w:tc>
+      </w:tr>
+    </w:tbl>
+    <w:p/>
+    <w:p>
+      <w:pPr>
+        <w:pStyle w:val="Heading2"/>
+        <w:keepNext/>
+        <w:spacing w:before="240" w:after="120"/>
+      </w:pPr>
+      <w:r>
+        <w:rPr>
+          <w:rFonts w:ascii="Outfit" w:hAnsi="Outfit"/>
+          <w:b/>
+          <w:color w:val="EC4899"/>
+          <w:sz w:val="32"/>
+        </w:rPr>
+        <w:t>6.3 Advanced Interactive Components (Client-Side Implementation)</w:t>
+      </w:r>
+    </w:p>
+    <w:p>
+      <w:pPr>
+        <w:pStyle w:val="Heading3"/>
+        <w:keepNext/>
+        <w:spacing w:before="240" w:after="120"/>
+      </w:pPr>
+      <w:r>
+        <w:rPr>
+          <w:rFonts w:ascii="Outfit" w:hAnsi="Outfit"/>
+          <w:b/>
+          <w:color w:val="1F2937"/>
+          <w:sz w:val="26"/>
+        </w:rPr>
+        <w:t>6.3.1 The 3D Interactive Payment Card Flipper</w:t>
+      </w:r>
+    </w:p>
+    <w:p>
+      <w:pPr>
+        <w:spacing w:after="120" w:line="276" w:lineRule="auto"/>
+        <w:jc w:val="left"/>
+      </w:pPr>
+      <w:r>
+        <w:rPr>
+          <w:rFonts w:ascii="Outfit" w:hAnsi="Outfit"/>
+          <w:b w:val="0"/>
+          <w:i w:val="0"/>
+          <w:sz w:val="22"/>
+        </w:rPr>
+        <w:t>To remove friction from the checkout phase, checkout.html features an immersive credit card simulator that flips in 3D perspective based on input focus.</w:t>
+      </w:r>
+    </w:p>
+    <w:p>
+      <w:pPr>
+        <w:spacing w:after="120" w:line="276" w:lineRule="auto"/>
+        <w:jc w:val="left"/>
+      </w:pPr>
+      <w:r>
+        <w:rPr>
+          <w:rFonts w:ascii="Outfit" w:hAnsi="Outfit"/>
+          <w:b w:val="0"/>
+          <w:i w:val="0"/>
+          <w:sz w:val="22"/>
+        </w:rPr>
+        <w:t>- Visual Presentation: Styled using dual absolute-positioned layers (.flip-card-front and .flip-card-back) bound under a parent container with perspective: 1000px and transform-style: preserve-3d. Back-facing layers utilize -webkit-backface-visibility: hidden to mask reversed contents.</w:t>
+      </w:r>
+    </w:p>
+    <w:p>
+      <w:pPr>
+        <w:spacing w:after="120" w:line="276" w:lineRule="auto"/>
+        <w:jc w:val="left"/>
+      </w:pPr>
+      <w:r>
+        <w:rPr>
+          <w:rFonts w:ascii="Outfit" w:hAnsi="Outfit"/>
+          <w:b w:val="0"/>
+          <w:i w:val="0"/>
+          <w:sz w:val="22"/>
+        </w:rPr>
+        <w:t>- Behavioral Logic: Focus event listeners monitor input zones. When CVV fields gain focus, a JavaScript helper inserts .flipped class, executing transform: rotateY(180deg) using hardware-accelerated transitions.</w:t>
+      </w:r>
+    </w:p>
+    <w:p>
+      <w:pPr>
+        <w:spacing w:after="120" w:line="276" w:lineRule="auto"/>
+        <w:jc w:val="left"/>
+      </w:pPr>
+      <w:r>
+        <w:rPr>
+          <w:rFonts w:ascii="Outfit" w:hAnsi="Outfit"/>
+          <w:b w:val="0"/>
+          <w:i w:val="0"/>
+          <w:sz w:val="22"/>
+        </w:rPr>
+        <w:t>- Data Sync Pipeline: Real-time keystroke listeners sync input strings (Cardholder, Card Number, Expiry) immediately into styled layouts, auto-formatting input strings with spaces every four digits for high readability.</w:t>
+      </w:r>
+    </w:p>
+    <w:p>
+      <w:pPr>
+        <w:pStyle w:val="Heading3"/>
+        <w:keepNext/>
+        <w:spacing w:before="240" w:after="120"/>
+      </w:pPr>
+      <w:r>
+        <w:rPr>
+          <w:rFonts w:ascii="Outfit" w:hAnsi="Outfit"/>
+          <w:b/>
+          <w:color w:val="1F2937"/>
+          <w:sz w:val="26"/>
+        </w:rPr>
+        <w:t>6.3.2 HTML5 Touch-Enabled Digital Signature Pad</w:t>
+      </w:r>
+    </w:p>
+    <w:p>
+      <w:pPr>
+        <w:spacing w:after="120" w:line="276" w:lineRule="auto"/>
+        <w:jc w:val="left"/>
+      </w:pPr>
+      <w:r>
+        <w:rPr>
+          <w:rFonts w:ascii="Outfit" w:hAnsi="Outfit"/>
+          <w:b w:val="0"/>
+          <w:i w:val="0"/>
+          <w:sz w:val="22"/>
+        </w:rPr>
+        <w:t>To satisfy rental liability compliance, the checkout interface features an HTML5 canvas signature pad enabling renters to draw binding digital contracts.</w:t>
+      </w:r>
+    </w:p>
+    <w:p>
+      <w:pPr>
+        <w:spacing w:after="120" w:line="276" w:lineRule="auto"/>
+        <w:jc w:val="left"/>
+      </w:pPr>
+      <w:r>
+        <w:rPr>
+          <w:rFonts w:ascii="Outfit" w:hAnsi="Outfit"/>
+          <w:b w:val="0"/>
+          <w:i w:val="0"/>
+          <w:sz w:val="22"/>
+        </w:rPr>
+        <w:t>- Canvas Rendering Context: Listens to mouse (mousedown, mouseup, mousemove) and equivalent mobile touch events to trace coordinates across a 2D context using specific line parameters matching the Indigo branding theme.</w:t>
+      </w:r>
+    </w:p>
+    <w:p>
+      <w:pPr>
+        <w:spacing w:after="120" w:line="276" w:lineRule="auto"/>
+        <w:jc w:val="left"/>
+      </w:pPr>
+      <w:r>
+        <w:rPr>
+          <w:rFonts w:ascii="Outfit" w:hAnsi="Outfit"/>
+          <w:b w:val="0"/>
+          <w:i w:val="0"/>
+          <w:sz w:val="22"/>
+        </w:rPr>
+        <w:t>- Base64 Serialization: Upon releasing drawing inputs, standard Canvas stroke geometries are compressed and serialized into a base64 encoded PNG data URI (data:image/png;base64,...) and updated to a hidden input container. On submit, Django reads and saves this byte-string directly to the database media models.</w:t>
+      </w:r>
+    </w:p>
+    <w:p>
+      <w:pPr>
+        <w:pStyle w:val="Heading3"/>
+        <w:keepNext/>
+        <w:spacing w:before="240" w:after="120"/>
+      </w:pPr>
+      <w:r>
+        <w:rPr>
+          <w:rFonts w:ascii="Outfit" w:hAnsi="Outfit"/>
+          <w:b/>
+          <w:color w:val="1F2937"/>
+          <w:sz w:val="26"/>
+        </w:rPr>
+        <w:t>6.3.3 Dynamic Locked-Date Calendar Booker Widget</w:t>
+      </w:r>
+    </w:p>
+    <w:p>
+      <w:pPr>
+        <w:spacing w:after="120" w:line="276" w:lineRule="auto"/>
+        <w:jc w:val="left"/>
+      </w:pPr>
+      <w:r>
+        <w:rPr>
+          <w:rFonts w:ascii="Outfit" w:hAnsi="Outfit"/>
+          <w:b w:val="0"/>
+          <w:i w:val="0"/>
+          <w:sz w:val="22"/>
+        </w:rPr>
+        <w:t>On the car_detail.html specification display, customers reserve date intervals using an interactive, custom-designed calendar widget.</w:t>
+      </w:r>
+    </w:p>
+    <w:p>
+      <w:pPr>
+        <w:spacing w:after="120" w:line="276" w:lineRule="auto"/>
+        <w:jc w:val="left"/>
+      </w:pPr>
+      <w:r>
+        <w:rPr>
+          <w:rFonts w:ascii="Outfit" w:hAnsi="Outfit"/>
+          <w:b w:val="0"/>
+          <w:i w:val="0"/>
+          <w:sz w:val="22"/>
+        </w:rPr>
+        <w:t>- Dynamic Render Loop: Reads active year/month offsets to generate absolute calendar matrix cells client-side in real-time.</w:t>
+      </w:r>
+    </w:p>
+    <w:p>
+      <w:pPr>
+        <w:spacing w:after="120" w:line="276" w:lineRule="auto"/>
+        <w:jc w:val="left"/>
+      </w:pPr>
+      <w:r>
+        <w:rPr>
+          <w:rFonts w:ascii="Outfit" w:hAnsi="Outfit"/>
+          <w:b w:val="0"/>
+          <w:i w:val="0"/>
+          <w:sz w:val="22"/>
+        </w:rPr>
+        <w:t>- Backend Blocked Range Integration: Django queries conflicting bookings, formats them as a JSON list, and passes them to the template context. The JavaScript calendar loops through these ranges, applying .blocked classes and disabled attributes to cells overlapping existing reservations.</w:t>
+      </w:r>
+    </w:p>
+    <w:p>
+      <w:pPr>
+        <w:spacing w:after="120" w:line="276" w:lineRule="auto"/>
+        <w:jc w:val="left"/>
+      </w:pPr>
+      <w:r>
+        <w:rPr>
+          <w:rFonts w:ascii="Outfit" w:hAnsi="Outfit"/>
+          <w:b w:val="0"/>
+          <w:i w:val="0"/>
+          <w:sz w:val="22"/>
+        </w:rPr>
+        <w:t>- Visual Capping &amp; Range Selection: Detects first and second clicks to define start/end dates, colorizing intermediate cells with custom HSL gradient overlays, and instantly feeds total duration bounds to the pricing engine.</w:t>
+      </w:r>
+    </w:p>
+    <w:p>
+      <w:pPr>
+        <w:pStyle w:val="Heading3"/>
+        <w:keepNext/>
+        <w:spacing w:before="240" w:after="120"/>
+      </w:pPr>
+      <w:r>
+        <w:rPr>
+          <w:rFonts w:ascii="Outfit" w:hAnsi="Outfit"/>
+          <w:b/>
+          <w:color w:val="1F2937"/>
+          <w:sz w:val="26"/>
+        </w:rPr>
+        <w:t>6.3.4 Form-Interception Submission Loader System</w:t>
+      </w:r>
+    </w:p>
+    <w:p>
+      <w:pPr>
+        <w:spacing w:after="120" w:line="276" w:lineRule="auto"/>
+        <w:jc w:val="left"/>
+      </w:pPr>
+      <w:r>
+        <w:rPr>
+          <w:rFonts w:ascii="Outfit" w:hAnsi="Outfit"/>
+          <w:b w:val="0"/>
+          <w:i w:val="0"/>
+          <w:sz w:val="22"/>
+        </w:rPr>
+        <w:t>To maintain visual stability during slower server-side processes (e.g. OTP validation or license uploads), a global glassmorphic loading overlay is integrated:</w:t>
+      </w:r>
+    </w:p>
+    <w:p>
+      <w:pPr>
+        <w:spacing w:after="120" w:line="276" w:lineRule="auto"/>
+        <w:jc w:val="left"/>
+      </w:pPr>
+      <w:r>
+        <w:rPr>
+          <w:rFonts w:ascii="Outfit" w:hAnsi="Outfit"/>
+          <w:b w:val="0"/>
+          <w:i w:val="0"/>
+          <w:sz w:val="22"/>
+        </w:rPr>
+        <w:t>- Submit Interception: A centralized script scans all page forms and attaches submission listeners. When a form fires, it verifies validation rules (checkValidity()). If validated, it activates a global overlay.</w:t>
+      </w:r>
+    </w:p>
+    <w:p>
+      <w:pPr>
+        <w:spacing w:after="120" w:line="276" w:lineRule="auto"/>
+        <w:jc w:val="left"/>
+      </w:pPr>
+      <w:r>
+        <w:rPr>
+          <w:rFonts w:ascii="Outfit" w:hAnsi="Outfit"/>
+          <w:b w:val="0"/>
+          <w:i w:val="0"/>
+          <w:sz w:val="22"/>
+        </w:rPr>
+        <w:t>- Dual Rotating Spinner: Rendered using a translucent circular ring rotating under specific infinite keyframe timelines, accompanied by a pulsing status message specifying the exact process (e.g., 'Securing your connection &amp; authenticating...').</w:t>
+      </w:r>
+    </w:p>
+    <w:p>
+      <w:pPr>
+        <w:pStyle w:val="Heading2"/>
+        <w:keepNext/>
+        <w:spacing w:before="240" w:after="120"/>
+      </w:pPr>
+      <w:r>
+        <w:rPr>
+          <w:rFonts w:ascii="Outfit" w:hAnsi="Outfit"/>
+          <w:b/>
+          <w:color w:val="EC4899"/>
+          <w:sz w:val="32"/>
+        </w:rPr>
+        <w:t>6.4 Key Screen Designs and Layout Profiles</w:t>
+      </w:r>
+    </w:p>
+    <w:p>
+      <w:pPr>
+        <w:spacing w:after="120" w:line="276" w:lineRule="auto"/>
+        <w:jc w:val="left"/>
+      </w:pPr>
+      <w:r>
+        <w:rPr>
+          <w:rFonts w:ascii="Outfit" w:hAnsi="Outfit"/>
+          <w:b w:val="0"/>
+          <w:i w:val="0"/>
+          <w:sz w:val="22"/>
+        </w:rPr>
+        <w:t>- Futuristic Home Platform (index.html): Employs an ultra-wide hero banner with layered radial gradient lights. Car listings display with dynamic CSS scale hover scaling (scale(1.03)), casting indigo drop-shadows on active states.</w:t>
+      </w:r>
+    </w:p>
+    <w:p>
+      <w:pPr>
+        <w:spacing w:after="120" w:line="276" w:lineRule="auto"/>
+        <w:jc w:val="left"/>
+      </w:pPr>
+      <w:r>
+        <w:rPr>
+          <w:rFonts w:ascii="Outfit" w:hAnsi="Outfit"/>
+          <w:b w:val="0"/>
+          <w:i w:val="0"/>
+          <w:sz w:val="22"/>
+        </w:rPr>
+        <w:t>- Dual-Column Search Desk (car_search.html): Employs a sticky left sidebar holding range sliders, category tags, and check elements, feeding criteria to real-time search lists on the right side.</w:t>
+      </w:r>
+    </w:p>
+    <w:p>
+      <w:pPr>
+        <w:spacing w:after="120" w:line="276" w:lineRule="auto"/>
+        <w:jc w:val="left"/>
+      </w:pPr>
+      <w:r>
+        <w:rPr>
+          <w:rFonts w:ascii="Outfit" w:hAnsi="Outfit"/>
+          <w:b w:val="0"/>
+          <w:i w:val="0"/>
+          <w:sz w:val="22"/>
+        </w:rPr>
+        <w:t>- Dashboard Hubs (dashboard_customer/vendor/admin.html): Multi-role dashboards styled using consistent modular layouts. Highlight stats are displayed in glow cards, followed by responsive transaction data lists styled with thin border matrices.</w:t>
       </w:r>
     </w:p>
     <w:p>

</xml_diff>